<commit_message>
fix: 署名、年份与 CITATION.cff 口径
- LICENSE / CITATION.cff 作者署名由占位符改为 gongsjie3-cyber，移除 affiliation 占位
- 年份修正：系统时钟与 GitHub 服务器均确认当前为 2026-10，此前 LICENSE、
  CITATION.cff 与报告 §9 误写为 2025，全部改为 2026
- 报告 §9 补充「证据强度说明」：明确区分可验证的证据（confirmatory 数据文件的
  mtime 从未被流水线重写）与作者记录的时间点（派生文件 mtime 会被复跑刷新），
  并说明该节结论不依赖时间戳，而依赖模块 6 不重新估参这一可检验事实
- CITATION.cff 的 title/abstract 仍停留在旧口径（9,744 实验 / 两个子样本 /
  45,266 臂），已更新为 32,485 / 三个子样本 / 150,815 臂 / 5.383 亿曝光
- 报告 §4 措辞明确为「开发样本的全部 9,744 个实验」，避免与全项目口径混淆
</commit_message>
<xml_diff>
--- a/reports/report.docx
+++ b/reports/report.docx
@@ -2265,7 +2265,7 @@
           <w:rFonts w:ascii="Calibri" w:hAnsi="Calibri" w:eastAsia="PingFang SC"/>
           <w:sz w:val="21"/>
         </w:rPr>
-        <w:t>：对全部 9,744 个实验做臂级曝光分配的多项分布卡方检验（BH-FDR 控制多重比较），然后</w:t>
+        <w:t>：对开发样本的全部 9,744 个实验做臂级曝光分配的多项分布卡方检验（BH-FDR 控制多重比较），然后</w:t>
       </w:r>
       <w:r>
         <w:rPr>
@@ -6407,7 +6407,7 @@
                 <w:b/>
                 <w:sz w:val="19"/>
               </w:rPr>
-              <w:t>时间戳</w:t>
+              <w:t>时间</w:t>
             </w:r>
           </w:p>
         </w:tc>
@@ -6424,7 +6424,7 @@
                 <w:rFonts w:ascii="Calibri" w:hAnsi="Calibri" w:eastAsia="PingFang SC"/>
                 <w:sz w:val="19"/>
               </w:rPr>
-              <w:t>结论与代码冻结（results/02、04 与 reports/report.md 最后写入）</w:t>
+              <w:t>模块 1–5 的结论与代码完成、参数冻结（results/02、04 与本节之前的报告正文最后写入）</w:t>
             </w:r>
           </w:p>
         </w:tc>
@@ -6439,7 +6439,7 @@
                 <w:rFonts w:ascii="Calibri" w:hAnsi="Calibri" w:eastAsia="PingFang SC"/>
                 <w:sz w:val="19"/>
               </w:rPr>
-              <w:t>2025-10-10 16:21–16:22</w:t>
+              <w:t>2026-10-10</w:t>
             </w:r>
           </w:p>
         </w:tc>
@@ -6471,13 +6471,172 @@
                 <w:rFonts w:ascii="Calibri" w:hAnsi="Calibri" w:eastAsia="PingFang SC"/>
                 <w:sz w:val="19"/>
               </w:rPr>
-              <w:t>2025-10-13 21:14</w:t>
+              <w:t>2026-10-13 21:14</w:t>
             </w:r>
           </w:p>
         </w:tc>
       </w:tr>
     </w:tbl>
     <w:p/>
+    <w:p>
+      <w:pPr>
+        <w:spacing w:after="120"/>
+        <w:ind w:firstLine="0"/>
+      </w:pPr>
+      <w:r>
+        <w:rPr>
+          <w:rFonts w:ascii="Calibri" w:hAnsi="Calibri" w:eastAsia="PingFang SC"/>
+          <w:sz w:val="21"/>
+        </w:rPr>
+        <w:t xml:space="preserve">&gt; </w:t>
+      </w:r>
+      <w:r>
+        <w:rPr>
+          <w:rFonts w:ascii="Calibri" w:hAnsi="Calibri" w:eastAsia="PingFang SC"/>
+          <w:b/>
+          <w:sz w:val="21"/>
+        </w:rPr>
+        <w:t>证据强度说明（请如实理解）</w:t>
+      </w:r>
+      <w:r>
+        <w:rPr>
+          <w:rFonts w:ascii="Calibri" w:hAnsi="Calibri" w:eastAsia="PingFang SC"/>
+          <w:sz w:val="21"/>
+        </w:rPr>
+        <w:t xml:space="preserve">：上表中 confirmatory 数据文件的下载时间可直接验证——该文件由 </w:t>
+      </w:r>
+      <w:r>
+        <w:rPr>
+          <w:rFonts w:ascii="Menlo" w:hAnsi="Menlo"/>
+          <w:color w:val="B03060"/>
+          <w:sz w:val="20"/>
+        </w:rPr>
+        <w:t>scripts/fetch_data.py</w:t>
+      </w:r>
+      <w:r>
+        <w:rPr>
+          <w:rFonts w:ascii="Calibri" w:hAnsi="Calibri" w:eastAsia="PingFang SC"/>
+          <w:sz w:val="21"/>
+        </w:rPr>
+        <w:t xml:space="preserve"> 下载后从未被流水线重写，其 mtime 至今保持 </w:t>
+      </w:r>
+      <w:r>
+        <w:rPr>
+          <w:rFonts w:ascii="Menlo" w:hAnsi="Menlo"/>
+          <w:color w:val="B03060"/>
+          <w:sz w:val="20"/>
+        </w:rPr>
+        <w:t>2026-10-13 21:14:13</w:t>
+      </w:r>
+      <w:r>
+        <w:rPr>
+          <w:rFonts w:ascii="Calibri" w:hAnsi="Calibri" w:eastAsia="PingFang SC"/>
+          <w:sz w:val="21"/>
+        </w:rPr>
+        <w:t xml:space="preserve">。而开发阶段的时间点为作者记录，因为 </w:t>
+      </w:r>
+      <w:r>
+        <w:rPr>
+          <w:rFonts w:ascii="Menlo" w:hAnsi="Menlo"/>
+          <w:color w:val="B03060"/>
+          <w:sz w:val="20"/>
+        </w:rPr>
+        <w:t>results/</w:t>
+      </w:r>
+      <w:r>
+        <w:rPr>
+          <w:rFonts w:ascii="Calibri" w:hAnsi="Calibri" w:eastAsia="PingFang SC"/>
+          <w:sz w:val="21"/>
+        </w:rPr>
+        <w:t xml:space="preserve"> 下的派生产物在任何人复跑 </w:t>
+      </w:r>
+      <w:r>
+        <w:rPr>
+          <w:rFonts w:ascii="Menlo" w:hAnsi="Menlo"/>
+          <w:color w:val="B03060"/>
+          <w:sz w:val="20"/>
+        </w:rPr>
+        <w:t>src/run_all.py</w:t>
+      </w:r>
+      <w:r>
+        <w:rPr>
+          <w:rFonts w:ascii="Calibri" w:hAnsi="Calibri" w:eastAsia="PingFang SC"/>
+          <w:sz w:val="21"/>
+        </w:rPr>
+        <w:t xml:space="preserve"> 时 mtime 都会被刷新，事后无法从文件系统验证。</w:t>
+      </w:r>
+    </w:p>
+    <w:p>
+      <w:pPr>
+        <w:spacing w:after="120"/>
+        <w:ind w:firstLine="0"/>
+      </w:pPr>
+      <w:r>
+        <w:rPr>
+          <w:rFonts w:ascii="Calibri" w:hAnsi="Calibri" w:eastAsia="PingFang SC"/>
+          <w:sz w:val="21"/>
+        </w:rPr>
+        <w:t>&gt;</w:t>
+      </w:r>
+    </w:p>
+    <w:p>
+      <w:pPr>
+        <w:spacing w:after="120"/>
+        <w:ind w:firstLine="0"/>
+      </w:pPr>
+      <w:r>
+        <w:rPr>
+          <w:rFonts w:ascii="Calibri" w:hAnsi="Calibri" w:eastAsia="PingFang SC"/>
+          <w:sz w:val="21"/>
+        </w:rPr>
+        <w:t>&gt; 因此本节结论</w:t>
+      </w:r>
+      <w:r>
+        <w:rPr>
+          <w:rFonts w:ascii="Calibri" w:hAnsi="Calibri" w:eastAsia="PingFang SC"/>
+          <w:b/>
+          <w:sz w:val="21"/>
+        </w:rPr>
+        <w:t>不依赖时间戳</w:t>
+      </w:r>
+      <w:r>
+        <w:rPr>
+          <w:rFonts w:ascii="Calibri" w:hAnsi="Calibri" w:eastAsia="PingFang SC"/>
+          <w:sz w:val="21"/>
+        </w:rPr>
+        <w:t xml:space="preserve">，而依赖两个可被读者独立检验的事实：(1) 模块 6 的代码路径不重新估计任何参数，全部读自冻结的 </w:t>
+      </w:r>
+      <w:r>
+        <w:rPr>
+          <w:rFonts w:ascii="Menlo" w:hAnsi="Menlo"/>
+          <w:color w:val="B03060"/>
+          <w:sz w:val="20"/>
+        </w:rPr>
+        <w:t>results/02_effects_power.json</w:t>
+      </w:r>
+      <w:r>
+        <w:rPr>
+          <w:rFonts w:ascii="Calibri" w:hAnsi="Calibri" w:eastAsia="PingFang SC"/>
+          <w:sz w:val="21"/>
+        </w:rPr>
+        <w:t xml:space="preserve"> 与 </w:t>
+      </w:r>
+      <w:r>
+        <w:rPr>
+          <w:rFonts w:ascii="Menlo" w:hAnsi="Menlo"/>
+          <w:color w:val="B03060"/>
+          <w:sz w:val="20"/>
+        </w:rPr>
+        <w:t>results/04_decision_rules.json</w:t>
+      </w:r>
+      <w:r>
+        <w:rPr>
+          <w:rFonts w:ascii="Calibri" w:hAnsi="Calibri" w:eastAsia="PingFang SC"/>
+          <w:sz w:val="21"/>
+        </w:rPr>
+        <w:t>；(2) 读者可以只在一个子集上重跑模块 1–5、在另一个子集上跑模块 6，自行验证结论是否复现。</w:t>
+      </w:r>
+    </w:p>
     <w:p>
       <w:pPr>
         <w:spacing w:after="120"/>

</xml_diff>